<commit_message>
day 19 may 20
</commit_message>
<xml_diff>
--- a/Daily Classes.docx
+++ b/Daily Classes.docx
@@ -73,6 +73,181 @@
         <w:t xml:space="preserve"> </w:t>
       </w:r>
     </w:p>
+    <w:p/>
+    <w:p>
+      <w:pPr>
+        <w:pStyle w:val="Heading1"/>
+      </w:pPr>
+      <w:r>
+        <w:t>This Week Agenda</w:t>
+      </w:r>
+    </w:p>
+    <w:p>
+      <w:proofErr w:type="spellStart"/>
+      <w:r>
+        <w:t>WebAPI</w:t>
+      </w:r>
+      <w:proofErr w:type="spellEnd"/>
+      <w:r>
+        <w:t xml:space="preserve">, features, connection, exception, </w:t>
+      </w:r>
+      <w:proofErr w:type="spellStart"/>
+      <w:proofErr w:type="gramStart"/>
+      <w:r>
+        <w:t>communication,authentication</w:t>
+      </w:r>
+      <w:proofErr w:type="spellEnd"/>
+      <w:proofErr w:type="gramEnd"/>
+      <w:r>
+        <w:t xml:space="preserve"> and auth</w:t>
+      </w:r>
+    </w:p>
+    <w:p>
+      <w:r>
+        <w:t xml:space="preserve">Optimizations, validation, </w:t>
+      </w:r>
+      <w:proofErr w:type="spellStart"/>
+      <w:proofErr w:type="gramStart"/>
+      <w:r>
+        <w:t>json</w:t>
+      </w:r>
+      <w:proofErr w:type="spellEnd"/>
+      <w:r>
+        <w:t xml:space="preserve"> ,</w:t>
+      </w:r>
+      <w:proofErr w:type="gramEnd"/>
+    </w:p>
+    <w:p>
+      <w:pPr>
+        <w:pStyle w:val="Heading1"/>
+      </w:pPr>
+      <w:r>
+        <w:t>Capstone Project</w:t>
+      </w:r>
+    </w:p>
+    <w:p>
+      <w:r>
+        <w:t xml:space="preserve">Level 1: </w:t>
+      </w:r>
+      <w:r>
+        <w:t>AI can use for UI purpose.</w:t>
+      </w:r>
+      <w:r>
+        <w:t>, capstone project</w:t>
+      </w:r>
+    </w:p>
+    <w:p>
+      <w:r>
+        <w:t xml:space="preserve">Level 2: </w:t>
+      </w:r>
+      <w:r>
+        <w:t>Exchange of Project</w:t>
+      </w:r>
+      <w:r>
+        <w:t xml:space="preserve"> and add on features</w:t>
+      </w:r>
+    </w:p>
+    <w:p>
+      <w:r>
+        <w:t xml:space="preserve">Level 3: </w:t>
+      </w:r>
+      <w:r>
+        <w:t>Migration Project</w:t>
+      </w:r>
+    </w:p>
+    <w:p>
+      <w:pPr>
+        <w:pStyle w:val="Heading1"/>
+      </w:pPr>
+      <w:r>
+        <w:lastRenderedPageBreak/>
+        <w:t>Day 18 May 19</w:t>
+      </w:r>
+    </w:p>
+    <w:p>
+      <w:proofErr w:type="gramStart"/>
+      <w:r>
+        <w:t>Frontend(</w:t>
+      </w:r>
+      <w:proofErr w:type="gramEnd"/>
+      <w:r>
+        <w:t>Angular)</w:t>
+      </w:r>
+    </w:p>
+    <w:p>
+      <w:r>
+        <w:t>Frontend can understand JSON, HTML, Text;</w:t>
+      </w:r>
+    </w:p>
+    <w:p/>
+    <w:p/>
+    <w:p>
+      <w:pPr>
+        <w:pStyle w:val="Heading1"/>
+      </w:pPr>
+      <w:r>
+        <w:t>Day 19 May 20</w:t>
+      </w:r>
+    </w:p>
+    <w:p>
+      <w:r>
+        <w:drawing>
+          <wp:inline distT="0" distB="0" distL="0" distR="0" wp14:anchorId="61188E68" wp14:editId="60CE55A4">
+            <wp:extent cx="5943600" cy="3761105"/>
+            <wp:effectExtent l="0" t="0" r="0" b="0"/>
+            <wp:docPr id="996700844" name="Picture 1"/>
+            <wp:cNvGraphicFramePr>
+              <a:graphicFrameLocks xmlns:a="http://schemas.openxmlformats.org/drawingml/2006/main" noChangeAspect="1"/>
+            </wp:cNvGraphicFramePr>
+            <a:graphic xmlns:a="http://schemas.openxmlformats.org/drawingml/2006/main">
+              <a:graphicData uri="http://schemas.openxmlformats.org/drawingml/2006/picture">
+                <pic:pic xmlns:pic="http://schemas.openxmlformats.org/drawingml/2006/picture">
+                  <pic:nvPicPr>
+                    <pic:cNvPr id="996700844" name=""/>
+                    <pic:cNvPicPr/>
+                  </pic:nvPicPr>
+                  <pic:blipFill>
+                    <a:blip r:embed="rId4"/>
+                    <a:stretch>
+                      <a:fillRect/>
+                    </a:stretch>
+                  </pic:blipFill>
+                  <pic:spPr>
+                    <a:xfrm>
+                      <a:off x="0" y="0"/>
+                      <a:ext cx="5943600" cy="3761105"/>
+                    </a:xfrm>
+                    <a:prstGeom prst="rect">
+                      <a:avLst/>
+                    </a:prstGeom>
+                  </pic:spPr>
+                </pic:pic>
+              </a:graphicData>
+            </a:graphic>
+          </wp:inline>
+        </w:drawing>
+      </w:r>
+    </w:p>
+    <w:p>
+      <w:r>
+        <w:t>Dependency Injection</w:t>
+      </w:r>
+    </w:p>
+    <w:p>
+      <w:r>
+        <w:t>Scope, transit</w:t>
+      </w:r>
+      <w:r>
+        <w:t>,</w:t>
+      </w:r>
+    </w:p>
+    <w:p>
+      <w:r>
+        <w:t>DTO</w:t>
+      </w:r>
+    </w:p>
+    <w:p/>
+    <w:p/>
     <w:sectPr>
       <w:pgSz w:w="12240" w:h="15840"/>
       <w:pgMar w:top="1440" w:right="1440" w:bottom="1440" w:left="1440" w:header="720" w:footer="720" w:gutter="0"/>

</xml_diff>

<commit_message>
day 20 may 21
</commit_message>
<xml_diff>
--- a/Daily Classes.docx
+++ b/Daily Classes.docx
@@ -191,6 +191,9 @@
     </w:p>
     <w:p>
       <w:r>
+        <w:rPr>
+          <w:noProof/>
+        </w:rPr>
         <w:drawing>
           <wp:inline distT="0" distB="0" distL="0" distR="0" wp14:anchorId="61188E68" wp14:editId="60CE55A4">
             <wp:extent cx="5943600" cy="3761105"/>
@@ -246,6 +249,1530 @@
         <w:t>DTO</w:t>
       </w:r>
     </w:p>
+    <w:p/>
+    <w:p>
+      <w:pPr>
+        <w:pStyle w:val="Heading1"/>
+      </w:pPr>
+      <w:r>
+        <w:lastRenderedPageBreak/>
+        <w:t>Day 20 May 21</w:t>
+      </w:r>
+    </w:p>
+    <w:p>
+      <w:r>
+        <w:drawing>
+          <wp:inline distT="0" distB="0" distL="0" distR="0" wp14:anchorId="66AE0D83" wp14:editId="5F2278E7">
+            <wp:extent cx="5943600" cy="3700145"/>
+            <wp:effectExtent l="0" t="0" r="0" b="0"/>
+            <wp:docPr id="670208887" name="Picture 1"/>
+            <wp:cNvGraphicFramePr>
+              <a:graphicFrameLocks xmlns:a="http://schemas.openxmlformats.org/drawingml/2006/main" noChangeAspect="1"/>
+            </wp:cNvGraphicFramePr>
+            <a:graphic xmlns:a="http://schemas.openxmlformats.org/drawingml/2006/main">
+              <a:graphicData uri="http://schemas.openxmlformats.org/drawingml/2006/picture">
+                <pic:pic xmlns:pic="http://schemas.openxmlformats.org/drawingml/2006/picture">
+                  <pic:nvPicPr>
+                    <pic:cNvPr id="670208887" name=""/>
+                    <pic:cNvPicPr/>
+                  </pic:nvPicPr>
+                  <pic:blipFill>
+                    <a:blip r:embed="rId5"/>
+                    <a:stretch>
+                      <a:fillRect/>
+                    </a:stretch>
+                  </pic:blipFill>
+                  <pic:spPr>
+                    <a:xfrm>
+                      <a:off x="0" y="0"/>
+                      <a:ext cx="5943600" cy="3700145"/>
+                    </a:xfrm>
+                    <a:prstGeom prst="rect">
+                      <a:avLst/>
+                    </a:prstGeom>
+                  </pic:spPr>
+                </pic:pic>
+              </a:graphicData>
+            </a:graphic>
+          </wp:inline>
+        </w:drawing>
+      </w:r>
+    </w:p>
+    <w:tbl>
+      <w:tblPr>
+        <w:tblW w:w="0" w:type="auto"/>
+        <w:tblCellSpacing w:w="15" w:type="dxa"/>
+        <w:tblCellMar>
+          <w:top w:w="15" w:type="dxa"/>
+          <w:left w:w="15" w:type="dxa"/>
+          <w:bottom w:w="15" w:type="dxa"/>
+          <w:right w:w="15" w:type="dxa"/>
+        </w:tblCellMar>
+        <w:tblLook w:val="04A0" w:firstRow="1" w:lastRow="0" w:firstColumn="1" w:lastColumn="0" w:noHBand="0" w:noVBand="1"/>
+      </w:tblPr>
+      <w:tblGrid>
+        <w:gridCol w:w="4716"/>
+        <w:gridCol w:w="4644"/>
+      </w:tblGrid>
+      <w:tr>
+        <w:trPr>
+          <w:tblHeader/>
+          <w:tblCellSpacing w:w="15" w:type="dxa"/>
+        </w:trPr>
+        <w:tc>
+          <w:tcPr>
+            <w:tcW w:w="0" w:type="auto"/>
+            <w:vAlign w:val="center"/>
+            <w:hideMark/>
+          </w:tcPr>
+          <w:p>
+            <w:pPr>
+              <w:spacing w:after="0" w:line="240" w:lineRule="auto"/>
+              <w:jc w:val="center"/>
+              <w:rPr>
+                <w:rFonts w:ascii="Times New Roman" w:eastAsia="Times New Roman" w:hAnsi="Times New Roman" w:cs="Times New Roman"/>
+                <w:b/>
+                <w:bCs/>
+                <w:color w:val="000000" w:themeColor="text1"/>
+                <w:kern w:val="0"/>
+                <w14:ligatures w14:val="none"/>
+              </w:rPr>
+            </w:pPr>
+            <w:r>
+              <w:rPr>
+                <w:rFonts w:ascii="Times New Roman" w:eastAsia="Times New Roman" w:hAnsi="Times New Roman" w:cs="Times New Roman"/>
+                <w:b/>
+                <w:bCs/>
+                <w:color w:val="000000" w:themeColor="text1"/>
+                <w:kern w:val="0"/>
+                <w14:ligatures w14:val="none"/>
+              </w:rPr>
+              <w:t>Capstone Project Title</w:t>
+            </w:r>
+          </w:p>
+        </w:tc>
+        <w:tc>
+          <w:tcPr>
+            <w:tcW w:w="0" w:type="auto"/>
+            <w:vAlign w:val="center"/>
+            <w:hideMark/>
+          </w:tcPr>
+          <w:p>
+            <w:pPr>
+              <w:spacing w:after="0" w:line="240" w:lineRule="auto"/>
+              <w:jc w:val="center"/>
+              <w:rPr>
+                <w:rFonts w:ascii="Times New Roman" w:eastAsia="Times New Roman" w:hAnsi="Times New Roman" w:cs="Times New Roman"/>
+                <w:b/>
+                <w:bCs/>
+                <w:color w:val="000000" w:themeColor="text1"/>
+                <w:kern w:val="0"/>
+                <w14:ligatures w14:val="none"/>
+              </w:rPr>
+            </w:pPr>
+            <w:r>
+              <w:rPr>
+                <w:rFonts w:ascii="Times New Roman" w:eastAsia="Times New Roman" w:hAnsi="Times New Roman" w:cs="Times New Roman"/>
+                <w:b/>
+                <w:bCs/>
+                <w:color w:val="000000" w:themeColor="text1"/>
+                <w:kern w:val="0"/>
+                <w14:ligatures w14:val="none"/>
+              </w:rPr>
+              <w:t>Students</w:t>
+            </w:r>
+          </w:p>
+        </w:tc>
+      </w:tr>
+      <w:tr>
+        <w:trPr>
+          <w:tblCellSpacing w:w="15" w:type="dxa"/>
+        </w:trPr>
+        <w:tc>
+          <w:tcPr>
+            <w:tcW w:w="0" w:type="auto"/>
+            <w:vAlign w:val="center"/>
+            <w:hideMark/>
+          </w:tcPr>
+          <w:p>
+            <w:pPr>
+              <w:spacing w:after="0" w:line="240" w:lineRule="auto"/>
+              <w:rPr>
+                <w:rFonts w:ascii="Times New Roman" w:eastAsia="Times New Roman" w:hAnsi="Times New Roman" w:cs="Times New Roman"/>
+                <w:color w:val="000000" w:themeColor="text1"/>
+                <w:kern w:val="0"/>
+                <w14:ligatures w14:val="none"/>
+              </w:rPr>
+            </w:pPr>
+            <w:r>
+              <w:rPr>
+                <w:rFonts w:ascii="Times New Roman" w:eastAsia="Times New Roman" w:hAnsi="Times New Roman" w:cs="Times New Roman"/>
+                <w:color w:val="000000" w:themeColor="text1"/>
+                <w:kern w:val="0"/>
+                <w14:ligatures w14:val="none"/>
+              </w:rPr>
+              <w:t>Hospital Appointment &amp; Patient Management System</w:t>
+            </w:r>
+          </w:p>
+        </w:tc>
+        <w:tc>
+          <w:tcPr>
+            <w:tcW w:w="0" w:type="auto"/>
+            <w:vAlign w:val="center"/>
+            <w:hideMark/>
+          </w:tcPr>
+          <w:p>
+            <w:pPr>
+              <w:spacing w:after="0" w:line="240" w:lineRule="auto"/>
+              <w:rPr>
+                <w:rFonts w:ascii="Times New Roman" w:eastAsia="Times New Roman" w:hAnsi="Times New Roman" w:cs="Times New Roman"/>
+                <w:color w:val="000000" w:themeColor="text1"/>
+                <w:kern w:val="0"/>
+                <w14:ligatures w14:val="none"/>
+              </w:rPr>
+            </w:pPr>
+            <w:r>
+              <w:rPr>
+                <w:rFonts w:ascii="Times New Roman" w:eastAsia="Times New Roman" w:hAnsi="Times New Roman" w:cs="Times New Roman"/>
+                <w:color w:val="000000" w:themeColor="text1"/>
+                <w:kern w:val="0"/>
+                <w14:ligatures w14:val="none"/>
+              </w:rPr>
+              <w:t>Affan Waseem Ahammed Mulla, Preetam Tony J</w:t>
+            </w:r>
+          </w:p>
+        </w:tc>
+      </w:tr>
+      <w:tr>
+        <w:trPr>
+          <w:tblCellSpacing w:w="15" w:type="dxa"/>
+        </w:trPr>
+        <w:tc>
+          <w:tcPr>
+            <w:tcW w:w="0" w:type="auto"/>
+            <w:vAlign w:val="center"/>
+            <w:hideMark/>
+          </w:tcPr>
+          <w:p>
+            <w:pPr>
+              <w:spacing w:after="0" w:line="240" w:lineRule="auto"/>
+              <w:rPr>
+                <w:rFonts w:ascii="Times New Roman" w:eastAsia="Times New Roman" w:hAnsi="Times New Roman" w:cs="Times New Roman"/>
+                <w:color w:val="000000" w:themeColor="text1"/>
+                <w:kern w:val="0"/>
+                <w14:ligatures w14:val="none"/>
+              </w:rPr>
+            </w:pPr>
+            <w:r>
+              <w:rPr>
+                <w:rFonts w:ascii="Times New Roman" w:eastAsia="Times New Roman" w:hAnsi="Times New Roman" w:cs="Times New Roman"/>
+                <w:color w:val="000000" w:themeColor="text1"/>
+                <w:kern w:val="0"/>
+                <w14:ligatures w14:val="none"/>
+              </w:rPr>
+              <w:t>Smart Inventory &amp; Warehouse Management</w:t>
+            </w:r>
+          </w:p>
+        </w:tc>
+        <w:tc>
+          <w:tcPr>
+            <w:tcW w:w="0" w:type="auto"/>
+            <w:vAlign w:val="center"/>
+            <w:hideMark/>
+          </w:tcPr>
+          <w:p>
+            <w:pPr>
+              <w:spacing w:after="0" w:line="240" w:lineRule="auto"/>
+              <w:rPr>
+                <w:rFonts w:ascii="Times New Roman" w:eastAsia="Times New Roman" w:hAnsi="Times New Roman" w:cs="Times New Roman"/>
+                <w:color w:val="000000" w:themeColor="text1"/>
+                <w:kern w:val="0"/>
+                <w14:ligatures w14:val="none"/>
+              </w:rPr>
+            </w:pPr>
+            <w:r>
+              <w:rPr>
+                <w:rFonts w:ascii="Times New Roman" w:eastAsia="Times New Roman" w:hAnsi="Times New Roman" w:cs="Times New Roman"/>
+                <w:color w:val="000000" w:themeColor="text1"/>
+                <w:kern w:val="0"/>
+                <w14:ligatures w14:val="none"/>
+              </w:rPr>
+              <w:t>Akshaya K S, Raghav Arora</w:t>
+            </w:r>
+          </w:p>
+        </w:tc>
+      </w:tr>
+      <w:tr>
+        <w:trPr>
+          <w:tblCellSpacing w:w="15" w:type="dxa"/>
+        </w:trPr>
+        <w:tc>
+          <w:tcPr>
+            <w:tcW w:w="0" w:type="auto"/>
+            <w:vAlign w:val="center"/>
+            <w:hideMark/>
+          </w:tcPr>
+          <w:p>
+            <w:pPr>
+              <w:spacing w:after="0" w:line="240" w:lineRule="auto"/>
+              <w:rPr>
+                <w:rFonts w:ascii="Times New Roman" w:eastAsia="Times New Roman" w:hAnsi="Times New Roman" w:cs="Times New Roman"/>
+                <w:color w:val="000000" w:themeColor="text1"/>
+                <w:kern w:val="0"/>
+                <w14:ligatures w14:val="none"/>
+              </w:rPr>
+            </w:pPr>
+            <w:r>
+              <w:rPr>
+                <w:rFonts w:ascii="Times New Roman" w:eastAsia="Times New Roman" w:hAnsi="Times New Roman" w:cs="Times New Roman"/>
+                <w:color w:val="000000" w:themeColor="text1"/>
+                <w:kern w:val="0"/>
+                <w14:ligatures w14:val="none"/>
+              </w:rPr>
+              <w:t>HRMS &amp; Employee Lifecycle Management</w:t>
+            </w:r>
+          </w:p>
+        </w:tc>
+        <w:tc>
+          <w:tcPr>
+            <w:tcW w:w="0" w:type="auto"/>
+            <w:vAlign w:val="center"/>
+            <w:hideMark/>
+          </w:tcPr>
+          <w:p>
+            <w:pPr>
+              <w:spacing w:after="0" w:line="240" w:lineRule="auto"/>
+              <w:rPr>
+                <w:rFonts w:ascii="Times New Roman" w:eastAsia="Times New Roman" w:hAnsi="Times New Roman" w:cs="Times New Roman"/>
+                <w:color w:val="000000" w:themeColor="text1"/>
+                <w:kern w:val="0"/>
+                <w14:ligatures w14:val="none"/>
+              </w:rPr>
+            </w:pPr>
+            <w:r>
+              <w:rPr>
+                <w:rFonts w:ascii="Times New Roman" w:eastAsia="Times New Roman" w:hAnsi="Times New Roman" w:cs="Times New Roman"/>
+                <w:color w:val="000000" w:themeColor="text1"/>
+                <w:kern w:val="0"/>
+                <w14:ligatures w14:val="none"/>
+              </w:rPr>
+              <w:t>Ananya Ganapati Hegde, RENU AAYUSH MADDI</w:t>
+            </w:r>
+          </w:p>
+        </w:tc>
+      </w:tr>
+      <w:tr>
+        <w:trPr>
+          <w:tblCellSpacing w:w="15" w:type="dxa"/>
+        </w:trPr>
+        <w:tc>
+          <w:tcPr>
+            <w:tcW w:w="0" w:type="auto"/>
+            <w:vAlign w:val="center"/>
+            <w:hideMark/>
+          </w:tcPr>
+          <w:p>
+            <w:pPr>
+              <w:spacing w:after="0" w:line="240" w:lineRule="auto"/>
+              <w:rPr>
+                <w:rFonts w:ascii="Times New Roman" w:eastAsia="Times New Roman" w:hAnsi="Times New Roman" w:cs="Times New Roman"/>
+                <w:color w:val="000000" w:themeColor="text1"/>
+                <w:kern w:val="0"/>
+                <w14:ligatures w14:val="none"/>
+              </w:rPr>
+            </w:pPr>
+            <w:r>
+              <w:rPr>
+                <w:rFonts w:ascii="Times New Roman" w:eastAsia="Times New Roman" w:hAnsi="Times New Roman" w:cs="Times New Roman"/>
+                <w:color w:val="000000" w:themeColor="text1"/>
+                <w:kern w:val="0"/>
+                <w14:ligatures w14:val="none"/>
+              </w:rPr>
+              <w:t>Real Estate Property &amp; Rental Platform</w:t>
+            </w:r>
+          </w:p>
+        </w:tc>
+        <w:tc>
+          <w:tcPr>
+            <w:tcW w:w="0" w:type="auto"/>
+            <w:vAlign w:val="center"/>
+            <w:hideMark/>
+          </w:tcPr>
+          <w:p>
+            <w:pPr>
+              <w:spacing w:after="0" w:line="240" w:lineRule="auto"/>
+              <w:rPr>
+                <w:rFonts w:ascii="Times New Roman" w:eastAsia="Times New Roman" w:hAnsi="Times New Roman" w:cs="Times New Roman"/>
+                <w:color w:val="000000" w:themeColor="text1"/>
+                <w:kern w:val="0"/>
+                <w14:ligatures w14:val="none"/>
+              </w:rPr>
+            </w:pPr>
+            <w:r>
+              <w:rPr>
+                <w:rFonts w:ascii="Times New Roman" w:eastAsia="Times New Roman" w:hAnsi="Times New Roman" w:cs="Times New Roman"/>
+                <w:color w:val="000000" w:themeColor="text1"/>
+                <w:kern w:val="0"/>
+                <w14:ligatures w14:val="none"/>
+              </w:rPr>
+              <w:t>Arvind Vikram M S, Sabareesh T</w:t>
+            </w:r>
+          </w:p>
+        </w:tc>
+      </w:tr>
+      <w:tr>
+        <w:trPr>
+          <w:tblCellSpacing w:w="15" w:type="dxa"/>
+        </w:trPr>
+        <w:tc>
+          <w:tcPr>
+            <w:tcW w:w="0" w:type="auto"/>
+            <w:vAlign w:val="center"/>
+            <w:hideMark/>
+          </w:tcPr>
+          <w:p>
+            <w:pPr>
+              <w:spacing w:after="0" w:line="240" w:lineRule="auto"/>
+              <w:rPr>
+                <w:rFonts w:ascii="Times New Roman" w:eastAsia="Times New Roman" w:hAnsi="Times New Roman" w:cs="Times New Roman"/>
+                <w:color w:val="000000" w:themeColor="text1"/>
+                <w:kern w:val="0"/>
+                <w14:ligatures w14:val="none"/>
+              </w:rPr>
+            </w:pPr>
+            <w:r>
+              <w:rPr>
+                <w:rFonts w:ascii="Times New Roman" w:eastAsia="Times New Roman" w:hAnsi="Times New Roman" w:cs="Times New Roman"/>
+                <w:color w:val="000000" w:themeColor="text1"/>
+                <w:kern w:val="0"/>
+                <w14:ligatures w14:val="none"/>
+              </w:rPr>
+              <w:t>Online Examination &amp; Assessment Platform</w:t>
+            </w:r>
+          </w:p>
+        </w:tc>
+        <w:tc>
+          <w:tcPr>
+            <w:tcW w:w="0" w:type="auto"/>
+            <w:vAlign w:val="center"/>
+            <w:hideMark/>
+          </w:tcPr>
+          <w:p>
+            <w:pPr>
+              <w:spacing w:after="0" w:line="240" w:lineRule="auto"/>
+              <w:rPr>
+                <w:rFonts w:ascii="Times New Roman" w:eastAsia="Times New Roman" w:hAnsi="Times New Roman" w:cs="Times New Roman"/>
+                <w:color w:val="000000" w:themeColor="text1"/>
+                <w:kern w:val="0"/>
+                <w14:ligatures w14:val="none"/>
+              </w:rPr>
+            </w:pPr>
+            <w:r>
+              <w:rPr>
+                <w:rFonts w:ascii="Times New Roman" w:eastAsia="Times New Roman" w:hAnsi="Times New Roman" w:cs="Times New Roman"/>
+                <w:color w:val="000000" w:themeColor="text1"/>
+                <w:kern w:val="0"/>
+                <w14:ligatures w14:val="none"/>
+              </w:rPr>
+              <w:t>Aswin M A, Sai Nikitha NSR</w:t>
+            </w:r>
+          </w:p>
+        </w:tc>
+      </w:tr>
+      <w:tr>
+        <w:trPr>
+          <w:tblCellSpacing w:w="15" w:type="dxa"/>
+        </w:trPr>
+        <w:tc>
+          <w:tcPr>
+            <w:tcW w:w="0" w:type="auto"/>
+            <w:vAlign w:val="center"/>
+            <w:hideMark/>
+          </w:tcPr>
+          <w:p>
+            <w:pPr>
+              <w:spacing w:after="0" w:line="240" w:lineRule="auto"/>
+              <w:rPr>
+                <w:rFonts w:ascii="Times New Roman" w:eastAsia="Times New Roman" w:hAnsi="Times New Roman" w:cs="Times New Roman"/>
+                <w:color w:val="000000" w:themeColor="text1"/>
+                <w:kern w:val="0"/>
+                <w14:ligatures w14:val="none"/>
+              </w:rPr>
+            </w:pPr>
+            <w:r>
+              <w:rPr>
+                <w:rFonts w:ascii="Times New Roman" w:eastAsia="Times New Roman" w:hAnsi="Times New Roman" w:cs="Times New Roman"/>
+                <w:color w:val="000000" w:themeColor="text1"/>
+                <w:kern w:val="0"/>
+                <w14:ligatures w14:val="none"/>
+              </w:rPr>
+              <w:t>Restaurant Order &amp; Kitchen Management</w:t>
+            </w:r>
+          </w:p>
+        </w:tc>
+        <w:tc>
+          <w:tcPr>
+            <w:tcW w:w="0" w:type="auto"/>
+            <w:vAlign w:val="center"/>
+            <w:hideMark/>
+          </w:tcPr>
+          <w:p>
+            <w:pPr>
+              <w:spacing w:after="0" w:line="240" w:lineRule="auto"/>
+              <w:rPr>
+                <w:rFonts w:ascii="Times New Roman" w:eastAsia="Times New Roman" w:hAnsi="Times New Roman" w:cs="Times New Roman"/>
+                <w:color w:val="000000" w:themeColor="text1"/>
+                <w:kern w:val="0"/>
+                <w14:ligatures w14:val="none"/>
+              </w:rPr>
+            </w:pPr>
+            <w:proofErr w:type="spellStart"/>
+            <w:r>
+              <w:rPr>
+                <w:rFonts w:ascii="Times New Roman" w:eastAsia="Times New Roman" w:hAnsi="Times New Roman" w:cs="Times New Roman"/>
+                <w:color w:val="000000" w:themeColor="text1"/>
+                <w:kern w:val="0"/>
+                <w14:ligatures w14:val="none"/>
+              </w:rPr>
+              <w:t>Kokkula</w:t>
+            </w:r>
+            <w:proofErr w:type="spellEnd"/>
+            <w:r>
+              <w:rPr>
+                <w:rFonts w:ascii="Times New Roman" w:eastAsia="Times New Roman" w:hAnsi="Times New Roman" w:cs="Times New Roman"/>
+                <w:color w:val="000000" w:themeColor="text1"/>
+                <w:kern w:val="0"/>
+                <w14:ligatures w14:val="none"/>
+              </w:rPr>
+              <w:t xml:space="preserve"> Bhargav, Sarveswaran B</w:t>
+            </w:r>
+          </w:p>
+        </w:tc>
+      </w:tr>
+      <w:tr>
+        <w:trPr>
+          <w:tblCellSpacing w:w="15" w:type="dxa"/>
+        </w:trPr>
+        <w:tc>
+          <w:tcPr>
+            <w:tcW w:w="0" w:type="auto"/>
+            <w:vAlign w:val="center"/>
+            <w:hideMark/>
+          </w:tcPr>
+          <w:p>
+            <w:pPr>
+              <w:spacing w:after="0" w:line="240" w:lineRule="auto"/>
+              <w:rPr>
+                <w:rFonts w:ascii="Times New Roman" w:eastAsia="Times New Roman" w:hAnsi="Times New Roman" w:cs="Times New Roman"/>
+                <w:color w:val="000000" w:themeColor="text1"/>
+                <w:kern w:val="0"/>
+                <w14:ligatures w14:val="none"/>
+              </w:rPr>
+            </w:pPr>
+            <w:r>
+              <w:rPr>
+                <w:rFonts w:ascii="Times New Roman" w:eastAsia="Times New Roman" w:hAnsi="Times New Roman" w:cs="Times New Roman"/>
+                <w:color w:val="000000" w:themeColor="text1"/>
+                <w:kern w:val="0"/>
+                <w14:ligatures w14:val="none"/>
+              </w:rPr>
+              <w:t>Insurance Claim Processing System</w:t>
+            </w:r>
+          </w:p>
+        </w:tc>
+        <w:tc>
+          <w:tcPr>
+            <w:tcW w:w="0" w:type="auto"/>
+            <w:vAlign w:val="center"/>
+            <w:hideMark/>
+          </w:tcPr>
+          <w:p>
+            <w:pPr>
+              <w:spacing w:after="0" w:line="240" w:lineRule="auto"/>
+              <w:rPr>
+                <w:rFonts w:ascii="Times New Roman" w:eastAsia="Times New Roman" w:hAnsi="Times New Roman" w:cs="Times New Roman"/>
+                <w:color w:val="000000" w:themeColor="text1"/>
+                <w:kern w:val="0"/>
+                <w14:ligatures w14:val="none"/>
+              </w:rPr>
+            </w:pPr>
+            <w:proofErr w:type="spellStart"/>
+            <w:r>
+              <w:rPr>
+                <w:rFonts w:ascii="Times New Roman" w:eastAsia="Times New Roman" w:hAnsi="Times New Roman" w:cs="Times New Roman"/>
+                <w:color w:val="000000" w:themeColor="text1"/>
+                <w:kern w:val="0"/>
+                <w14:ligatures w14:val="none"/>
+              </w:rPr>
+              <w:t>Davish</w:t>
+            </w:r>
+            <w:proofErr w:type="spellEnd"/>
+            <w:r>
+              <w:rPr>
+                <w:rFonts w:ascii="Times New Roman" w:eastAsia="Times New Roman" w:hAnsi="Times New Roman" w:cs="Times New Roman"/>
+                <w:color w:val="000000" w:themeColor="text1"/>
+                <w:kern w:val="0"/>
+                <w14:ligatures w14:val="none"/>
+              </w:rPr>
+              <w:t xml:space="preserve"> E, Seema </w:t>
+            </w:r>
+            <w:proofErr w:type="spellStart"/>
+            <w:r>
+              <w:rPr>
+                <w:rFonts w:ascii="Times New Roman" w:eastAsia="Times New Roman" w:hAnsi="Times New Roman" w:cs="Times New Roman"/>
+                <w:color w:val="000000" w:themeColor="text1"/>
+                <w:kern w:val="0"/>
+                <w14:ligatures w14:val="none"/>
+              </w:rPr>
+              <w:t>maglin</w:t>
+            </w:r>
+            <w:proofErr w:type="spellEnd"/>
+            <w:r>
+              <w:rPr>
+                <w:rFonts w:ascii="Times New Roman" w:eastAsia="Times New Roman" w:hAnsi="Times New Roman" w:cs="Times New Roman"/>
+                <w:color w:val="000000" w:themeColor="text1"/>
+                <w:kern w:val="0"/>
+                <w14:ligatures w14:val="none"/>
+              </w:rPr>
+              <w:t xml:space="preserve"> S</w:t>
+            </w:r>
+          </w:p>
+        </w:tc>
+      </w:tr>
+      <w:tr>
+        <w:trPr>
+          <w:tblCellSpacing w:w="15" w:type="dxa"/>
+        </w:trPr>
+        <w:tc>
+          <w:tcPr>
+            <w:tcW w:w="0" w:type="auto"/>
+            <w:vAlign w:val="center"/>
+            <w:hideMark/>
+          </w:tcPr>
+          <w:p>
+            <w:pPr>
+              <w:spacing w:after="0" w:line="240" w:lineRule="auto"/>
+              <w:rPr>
+                <w:rFonts w:ascii="Times New Roman" w:eastAsia="Times New Roman" w:hAnsi="Times New Roman" w:cs="Times New Roman"/>
+                <w:color w:val="000000" w:themeColor="text1"/>
+                <w:kern w:val="0"/>
+                <w14:ligatures w14:val="none"/>
+              </w:rPr>
+            </w:pPr>
+            <w:r>
+              <w:rPr>
+                <w:rFonts w:ascii="Times New Roman" w:eastAsia="Times New Roman" w:hAnsi="Times New Roman" w:cs="Times New Roman"/>
+                <w:color w:val="000000" w:themeColor="text1"/>
+                <w:kern w:val="0"/>
+                <w14:ligatures w14:val="none"/>
+              </w:rPr>
+              <w:t>Logistics &amp; Shipment Tracking System</w:t>
+            </w:r>
+          </w:p>
+        </w:tc>
+        <w:tc>
+          <w:tcPr>
+            <w:tcW w:w="0" w:type="auto"/>
+            <w:vAlign w:val="center"/>
+            <w:hideMark/>
+          </w:tcPr>
+          <w:p>
+            <w:pPr>
+              <w:spacing w:after="0" w:line="240" w:lineRule="auto"/>
+              <w:rPr>
+                <w:rFonts w:ascii="Times New Roman" w:eastAsia="Times New Roman" w:hAnsi="Times New Roman" w:cs="Times New Roman"/>
+                <w:color w:val="000000" w:themeColor="text1"/>
+                <w:kern w:val="0"/>
+                <w14:ligatures w14:val="none"/>
+              </w:rPr>
+            </w:pPr>
+            <w:r>
+              <w:rPr>
+                <w:rFonts w:ascii="Times New Roman" w:eastAsia="Times New Roman" w:hAnsi="Times New Roman" w:cs="Times New Roman"/>
+                <w:color w:val="000000" w:themeColor="text1"/>
+                <w:kern w:val="0"/>
+                <w14:ligatures w14:val="none"/>
+              </w:rPr>
+              <w:t xml:space="preserve">Dhanush </w:t>
+            </w:r>
+            <w:proofErr w:type="spellStart"/>
+            <w:r>
+              <w:rPr>
+                <w:rFonts w:ascii="Times New Roman" w:eastAsia="Times New Roman" w:hAnsi="Times New Roman" w:cs="Times New Roman"/>
+                <w:color w:val="000000" w:themeColor="text1"/>
+                <w:kern w:val="0"/>
+                <w14:ligatures w14:val="none"/>
+              </w:rPr>
+              <w:t>Keloth</w:t>
+            </w:r>
+            <w:proofErr w:type="spellEnd"/>
+            <w:r>
+              <w:rPr>
+                <w:rFonts w:ascii="Times New Roman" w:eastAsia="Times New Roman" w:hAnsi="Times New Roman" w:cs="Times New Roman"/>
+                <w:color w:val="000000" w:themeColor="text1"/>
+                <w:kern w:val="0"/>
+                <w14:ligatures w14:val="none"/>
+              </w:rPr>
+              <w:t xml:space="preserve">, </w:t>
+            </w:r>
+            <w:proofErr w:type="spellStart"/>
+            <w:r>
+              <w:rPr>
+                <w:rFonts w:ascii="Times New Roman" w:eastAsia="Times New Roman" w:hAnsi="Times New Roman" w:cs="Times New Roman"/>
+                <w:color w:val="000000" w:themeColor="text1"/>
+                <w:kern w:val="0"/>
+                <w14:ligatures w14:val="none"/>
+              </w:rPr>
+              <w:t>Shethu</w:t>
+            </w:r>
+            <w:proofErr w:type="spellEnd"/>
+            <w:r>
+              <w:rPr>
+                <w:rFonts w:ascii="Times New Roman" w:eastAsia="Times New Roman" w:hAnsi="Times New Roman" w:cs="Times New Roman"/>
+                <w:color w:val="000000" w:themeColor="text1"/>
+                <w:kern w:val="0"/>
+                <w14:ligatures w14:val="none"/>
+              </w:rPr>
+              <w:t xml:space="preserve"> ram M R</w:t>
+            </w:r>
+          </w:p>
+        </w:tc>
+      </w:tr>
+      <w:tr>
+        <w:trPr>
+          <w:tblCellSpacing w:w="15" w:type="dxa"/>
+        </w:trPr>
+        <w:tc>
+          <w:tcPr>
+            <w:tcW w:w="0" w:type="auto"/>
+            <w:vAlign w:val="center"/>
+            <w:hideMark/>
+          </w:tcPr>
+          <w:p>
+            <w:pPr>
+              <w:spacing w:after="0" w:line="240" w:lineRule="auto"/>
+              <w:rPr>
+                <w:rFonts w:ascii="Times New Roman" w:eastAsia="Times New Roman" w:hAnsi="Times New Roman" w:cs="Times New Roman"/>
+                <w:color w:val="000000" w:themeColor="text1"/>
+                <w:kern w:val="0"/>
+                <w14:ligatures w14:val="none"/>
+              </w:rPr>
+            </w:pPr>
+            <w:r>
+              <w:rPr>
+                <w:rFonts w:ascii="Times New Roman" w:eastAsia="Times New Roman" w:hAnsi="Times New Roman" w:cs="Times New Roman"/>
+                <w:color w:val="000000" w:themeColor="text1"/>
+                <w:kern w:val="0"/>
+                <w14:ligatures w14:val="none"/>
+              </w:rPr>
+              <w:t>E-Commerce Marketplace Platform</w:t>
+            </w:r>
+          </w:p>
+        </w:tc>
+        <w:tc>
+          <w:tcPr>
+            <w:tcW w:w="0" w:type="auto"/>
+            <w:vAlign w:val="center"/>
+            <w:hideMark/>
+          </w:tcPr>
+          <w:p>
+            <w:pPr>
+              <w:spacing w:after="0" w:line="240" w:lineRule="auto"/>
+              <w:rPr>
+                <w:rFonts w:ascii="Times New Roman" w:eastAsia="Times New Roman" w:hAnsi="Times New Roman" w:cs="Times New Roman"/>
+                <w:color w:val="000000" w:themeColor="text1"/>
+                <w:kern w:val="0"/>
+                <w14:ligatures w14:val="none"/>
+              </w:rPr>
+            </w:pPr>
+            <w:r>
+              <w:rPr>
+                <w:rFonts w:ascii="Times New Roman" w:eastAsia="Times New Roman" w:hAnsi="Times New Roman" w:cs="Times New Roman"/>
+                <w:color w:val="000000" w:themeColor="text1"/>
+                <w:kern w:val="0"/>
+                <w14:ligatures w14:val="none"/>
+              </w:rPr>
+              <w:t>Dharshini K, Siva Kavindra T</w:t>
+            </w:r>
+          </w:p>
+        </w:tc>
+      </w:tr>
+      <w:tr>
+        <w:trPr>
+          <w:tblCellSpacing w:w="15" w:type="dxa"/>
+        </w:trPr>
+        <w:tc>
+          <w:tcPr>
+            <w:tcW w:w="0" w:type="auto"/>
+            <w:vAlign w:val="center"/>
+            <w:hideMark/>
+          </w:tcPr>
+          <w:p>
+            <w:pPr>
+              <w:spacing w:after="0" w:line="240" w:lineRule="auto"/>
+              <w:rPr>
+                <w:rFonts w:ascii="Times New Roman" w:eastAsia="Times New Roman" w:hAnsi="Times New Roman" w:cs="Times New Roman"/>
+                <w:color w:val="000000" w:themeColor="text1"/>
+                <w:kern w:val="0"/>
+                <w14:ligatures w14:val="none"/>
+              </w:rPr>
+            </w:pPr>
+            <w:r>
+              <w:rPr>
+                <w:rFonts w:ascii="Times New Roman" w:eastAsia="Times New Roman" w:hAnsi="Times New Roman" w:cs="Times New Roman"/>
+                <w:color w:val="000000" w:themeColor="text1"/>
+                <w:kern w:val="0"/>
+                <w14:ligatures w14:val="none"/>
+              </w:rPr>
+              <w:t>School ERP Management System</w:t>
+            </w:r>
+          </w:p>
+        </w:tc>
+        <w:tc>
+          <w:tcPr>
+            <w:tcW w:w="0" w:type="auto"/>
+            <w:vAlign w:val="center"/>
+            <w:hideMark/>
+          </w:tcPr>
+          <w:p>
+            <w:pPr>
+              <w:spacing w:after="0" w:line="240" w:lineRule="auto"/>
+              <w:rPr>
+                <w:rFonts w:ascii="Times New Roman" w:eastAsia="Times New Roman" w:hAnsi="Times New Roman" w:cs="Times New Roman"/>
+                <w:color w:val="000000" w:themeColor="text1"/>
+                <w:kern w:val="0"/>
+                <w14:ligatures w14:val="none"/>
+              </w:rPr>
+            </w:pPr>
+            <w:proofErr w:type="spellStart"/>
+            <w:r>
+              <w:rPr>
+                <w:rFonts w:ascii="Times New Roman" w:eastAsia="Times New Roman" w:hAnsi="Times New Roman" w:cs="Times New Roman"/>
+                <w:color w:val="000000" w:themeColor="text1"/>
+                <w:kern w:val="0"/>
+                <w14:ligatures w14:val="none"/>
+              </w:rPr>
+              <w:t>Hareshwaran</w:t>
+            </w:r>
+            <w:proofErr w:type="spellEnd"/>
+            <w:r>
+              <w:rPr>
+                <w:rFonts w:ascii="Times New Roman" w:eastAsia="Times New Roman" w:hAnsi="Times New Roman" w:cs="Times New Roman"/>
+                <w:color w:val="000000" w:themeColor="text1"/>
+                <w:kern w:val="0"/>
+                <w14:ligatures w14:val="none"/>
+              </w:rPr>
+              <w:t xml:space="preserve"> S, Sivaprakash S</w:t>
+            </w:r>
+          </w:p>
+        </w:tc>
+      </w:tr>
+      <w:tr>
+        <w:trPr>
+          <w:tblCellSpacing w:w="15" w:type="dxa"/>
+        </w:trPr>
+        <w:tc>
+          <w:tcPr>
+            <w:tcW w:w="0" w:type="auto"/>
+            <w:vAlign w:val="center"/>
+            <w:hideMark/>
+          </w:tcPr>
+          <w:p>
+            <w:pPr>
+              <w:spacing w:after="0" w:line="240" w:lineRule="auto"/>
+              <w:rPr>
+                <w:rFonts w:ascii="Times New Roman" w:eastAsia="Times New Roman" w:hAnsi="Times New Roman" w:cs="Times New Roman"/>
+                <w:color w:val="000000" w:themeColor="text1"/>
+                <w:kern w:val="0"/>
+                <w14:ligatures w14:val="none"/>
+              </w:rPr>
+            </w:pPr>
+            <w:r>
+              <w:rPr>
+                <w:rFonts w:ascii="Times New Roman" w:eastAsia="Times New Roman" w:hAnsi="Times New Roman" w:cs="Times New Roman"/>
+                <w:color w:val="000000" w:themeColor="text1"/>
+                <w:kern w:val="0"/>
+                <w14:ligatures w14:val="none"/>
+              </w:rPr>
+              <w:t>Travel &amp; Tour Package Management</w:t>
+            </w:r>
+          </w:p>
+        </w:tc>
+        <w:tc>
+          <w:tcPr>
+            <w:tcW w:w="0" w:type="auto"/>
+            <w:vAlign w:val="center"/>
+            <w:hideMark/>
+          </w:tcPr>
+          <w:p>
+            <w:pPr>
+              <w:spacing w:after="0" w:line="240" w:lineRule="auto"/>
+              <w:rPr>
+                <w:rFonts w:ascii="Times New Roman" w:eastAsia="Times New Roman" w:hAnsi="Times New Roman" w:cs="Times New Roman"/>
+                <w:color w:val="000000" w:themeColor="text1"/>
+                <w:kern w:val="0"/>
+                <w14:ligatures w14:val="none"/>
+              </w:rPr>
+            </w:pPr>
+            <w:r>
+              <w:rPr>
+                <w:rFonts w:ascii="Times New Roman" w:eastAsia="Times New Roman" w:hAnsi="Times New Roman" w:cs="Times New Roman"/>
+                <w:color w:val="000000" w:themeColor="text1"/>
+                <w:kern w:val="0"/>
+                <w14:ligatures w14:val="none"/>
+              </w:rPr>
+              <w:t xml:space="preserve">Iniyan C M, </w:t>
+            </w:r>
+            <w:proofErr w:type="spellStart"/>
+            <w:r>
+              <w:rPr>
+                <w:rFonts w:ascii="Times New Roman" w:eastAsia="Times New Roman" w:hAnsi="Times New Roman" w:cs="Times New Roman"/>
+                <w:color w:val="000000" w:themeColor="text1"/>
+                <w:kern w:val="0"/>
+                <w14:ligatures w14:val="none"/>
+              </w:rPr>
+              <w:t>Sivasabari</w:t>
+            </w:r>
+            <w:proofErr w:type="spellEnd"/>
+            <w:r>
+              <w:rPr>
+                <w:rFonts w:ascii="Times New Roman" w:eastAsia="Times New Roman" w:hAnsi="Times New Roman" w:cs="Times New Roman"/>
+                <w:color w:val="000000" w:themeColor="text1"/>
+                <w:kern w:val="0"/>
+                <w14:ligatures w14:val="none"/>
+              </w:rPr>
+              <w:t xml:space="preserve"> P</w:t>
+            </w:r>
+          </w:p>
+        </w:tc>
+      </w:tr>
+      <w:tr>
+        <w:trPr>
+          <w:tblCellSpacing w:w="15" w:type="dxa"/>
+        </w:trPr>
+        <w:tc>
+          <w:tcPr>
+            <w:tcW w:w="0" w:type="auto"/>
+            <w:vAlign w:val="center"/>
+            <w:hideMark/>
+          </w:tcPr>
+          <w:p>
+            <w:pPr>
+              <w:spacing w:after="0" w:line="240" w:lineRule="auto"/>
+              <w:rPr>
+                <w:rFonts w:ascii="Times New Roman" w:eastAsia="Times New Roman" w:hAnsi="Times New Roman" w:cs="Times New Roman"/>
+                <w:color w:val="000000" w:themeColor="text1"/>
+                <w:kern w:val="0"/>
+                <w14:ligatures w14:val="none"/>
+              </w:rPr>
+            </w:pPr>
+            <w:r>
+              <w:rPr>
+                <w:rFonts w:ascii="Times New Roman" w:eastAsia="Times New Roman" w:hAnsi="Times New Roman" w:cs="Times New Roman"/>
+                <w:color w:val="000000" w:themeColor="text1"/>
+                <w:kern w:val="0"/>
+                <w14:ligatures w14:val="none"/>
+              </w:rPr>
+              <w:t>Event Management &amp; Ticketing Platform</w:t>
+            </w:r>
+          </w:p>
+        </w:tc>
+        <w:tc>
+          <w:tcPr>
+            <w:tcW w:w="0" w:type="auto"/>
+            <w:vAlign w:val="center"/>
+            <w:hideMark/>
+          </w:tcPr>
+          <w:p>
+            <w:pPr>
+              <w:spacing w:after="0" w:line="240" w:lineRule="auto"/>
+              <w:rPr>
+                <w:rFonts w:ascii="Times New Roman" w:eastAsia="Times New Roman" w:hAnsi="Times New Roman" w:cs="Times New Roman"/>
+                <w:color w:val="000000" w:themeColor="text1"/>
+                <w:kern w:val="0"/>
+                <w14:ligatures w14:val="none"/>
+              </w:rPr>
+            </w:pPr>
+            <w:proofErr w:type="spellStart"/>
+            <w:r>
+              <w:rPr>
+                <w:rFonts w:ascii="Times New Roman" w:eastAsia="Times New Roman" w:hAnsi="Times New Roman" w:cs="Times New Roman"/>
+                <w:color w:val="000000" w:themeColor="text1"/>
+                <w:kern w:val="0"/>
+                <w14:ligatures w14:val="none"/>
+              </w:rPr>
+              <w:t>KeerthiKeswaran</w:t>
+            </w:r>
+            <w:proofErr w:type="spellEnd"/>
+            <w:r>
+              <w:rPr>
+                <w:rFonts w:ascii="Times New Roman" w:eastAsia="Times New Roman" w:hAnsi="Times New Roman" w:cs="Times New Roman"/>
+                <w:color w:val="000000" w:themeColor="text1"/>
+                <w:kern w:val="0"/>
+                <w14:ligatures w14:val="none"/>
+              </w:rPr>
+              <w:t xml:space="preserve"> K S, Sri Manikandan R</w:t>
+            </w:r>
+          </w:p>
+        </w:tc>
+      </w:tr>
+      <w:tr>
+        <w:trPr>
+          <w:tblCellSpacing w:w="15" w:type="dxa"/>
+        </w:trPr>
+        <w:tc>
+          <w:tcPr>
+            <w:tcW w:w="0" w:type="auto"/>
+            <w:vAlign w:val="center"/>
+            <w:hideMark/>
+          </w:tcPr>
+          <w:p>
+            <w:pPr>
+              <w:spacing w:after="0" w:line="240" w:lineRule="auto"/>
+              <w:rPr>
+                <w:rFonts w:ascii="Times New Roman" w:eastAsia="Times New Roman" w:hAnsi="Times New Roman" w:cs="Times New Roman"/>
+                <w:color w:val="000000" w:themeColor="text1"/>
+                <w:kern w:val="0"/>
+                <w14:ligatures w14:val="none"/>
+              </w:rPr>
+            </w:pPr>
+            <w:r>
+              <w:rPr>
+                <w:rFonts w:ascii="Times New Roman" w:eastAsia="Times New Roman" w:hAnsi="Times New Roman" w:cs="Times New Roman"/>
+                <w:color w:val="000000" w:themeColor="text1"/>
+                <w:kern w:val="0"/>
+                <w14:ligatures w14:val="none"/>
+              </w:rPr>
+              <w:t>Fleet &amp; Vehicle Maintenance System</w:t>
+            </w:r>
+          </w:p>
+        </w:tc>
+        <w:tc>
+          <w:tcPr>
+            <w:tcW w:w="0" w:type="auto"/>
+            <w:vAlign w:val="center"/>
+            <w:hideMark/>
+          </w:tcPr>
+          <w:p>
+            <w:pPr>
+              <w:spacing w:after="0" w:line="240" w:lineRule="auto"/>
+              <w:rPr>
+                <w:rFonts w:ascii="Times New Roman" w:eastAsia="Times New Roman" w:hAnsi="Times New Roman" w:cs="Times New Roman"/>
+                <w:color w:val="000000" w:themeColor="text1"/>
+                <w:kern w:val="0"/>
+                <w14:ligatures w14:val="none"/>
+              </w:rPr>
+            </w:pPr>
+            <w:r>
+              <w:rPr>
+                <w:rFonts w:ascii="Times New Roman" w:eastAsia="Times New Roman" w:hAnsi="Times New Roman" w:cs="Times New Roman"/>
+                <w:color w:val="000000" w:themeColor="text1"/>
+                <w:kern w:val="0"/>
+                <w14:ligatures w14:val="none"/>
+              </w:rPr>
+              <w:t xml:space="preserve">Krishna Ketan Varia, </w:t>
+            </w:r>
+            <w:proofErr w:type="spellStart"/>
+            <w:r>
+              <w:rPr>
+                <w:rFonts w:ascii="Times New Roman" w:eastAsia="Times New Roman" w:hAnsi="Times New Roman" w:cs="Times New Roman"/>
+                <w:color w:val="000000" w:themeColor="text1"/>
+                <w:kern w:val="0"/>
+                <w14:ligatures w14:val="none"/>
+              </w:rPr>
+              <w:t>Sushan</w:t>
+            </w:r>
+            <w:proofErr w:type="spellEnd"/>
+            <w:r>
+              <w:rPr>
+                <w:rFonts w:ascii="Times New Roman" w:eastAsia="Times New Roman" w:hAnsi="Times New Roman" w:cs="Times New Roman"/>
+                <w:color w:val="000000" w:themeColor="text1"/>
+                <w:kern w:val="0"/>
+                <w14:ligatures w14:val="none"/>
+              </w:rPr>
+              <w:t xml:space="preserve"> Rai</w:t>
+            </w:r>
+          </w:p>
+        </w:tc>
+      </w:tr>
+      <w:tr>
+        <w:trPr>
+          <w:tblCellSpacing w:w="15" w:type="dxa"/>
+        </w:trPr>
+        <w:tc>
+          <w:tcPr>
+            <w:tcW w:w="0" w:type="auto"/>
+            <w:vAlign w:val="center"/>
+            <w:hideMark/>
+          </w:tcPr>
+          <w:p>
+            <w:pPr>
+              <w:spacing w:after="0" w:line="240" w:lineRule="auto"/>
+              <w:rPr>
+                <w:rFonts w:ascii="Times New Roman" w:eastAsia="Times New Roman" w:hAnsi="Times New Roman" w:cs="Times New Roman"/>
+                <w:color w:val="000000" w:themeColor="text1"/>
+                <w:kern w:val="0"/>
+                <w14:ligatures w14:val="none"/>
+              </w:rPr>
+            </w:pPr>
+            <w:r>
+              <w:rPr>
+                <w:rFonts w:ascii="Times New Roman" w:eastAsia="Times New Roman" w:hAnsi="Times New Roman" w:cs="Times New Roman"/>
+                <w:color w:val="000000" w:themeColor="text1"/>
+                <w:kern w:val="0"/>
+                <w14:ligatures w14:val="none"/>
+              </w:rPr>
+              <w:t>Complaint &amp; Grievance Redressal Portal</w:t>
+            </w:r>
+          </w:p>
+        </w:tc>
+        <w:tc>
+          <w:tcPr>
+            <w:tcW w:w="0" w:type="auto"/>
+            <w:vAlign w:val="center"/>
+            <w:hideMark/>
+          </w:tcPr>
+          <w:p>
+            <w:pPr>
+              <w:spacing w:after="0" w:line="240" w:lineRule="auto"/>
+              <w:rPr>
+                <w:rFonts w:ascii="Times New Roman" w:eastAsia="Times New Roman" w:hAnsi="Times New Roman" w:cs="Times New Roman"/>
+                <w:color w:val="000000" w:themeColor="text1"/>
+                <w:kern w:val="0"/>
+                <w14:ligatures w14:val="none"/>
+              </w:rPr>
+            </w:pPr>
+            <w:r>
+              <w:rPr>
+                <w:rFonts w:ascii="Times New Roman" w:eastAsia="Times New Roman" w:hAnsi="Times New Roman" w:cs="Times New Roman"/>
+                <w:color w:val="000000" w:themeColor="text1"/>
+                <w:kern w:val="0"/>
+                <w14:ligatures w14:val="none"/>
+              </w:rPr>
+              <w:t xml:space="preserve">Laxman P, C </w:t>
+            </w:r>
+            <w:proofErr w:type="spellStart"/>
+            <w:r>
+              <w:rPr>
+                <w:rFonts w:ascii="Times New Roman" w:eastAsia="Times New Roman" w:hAnsi="Times New Roman" w:cs="Times New Roman"/>
+                <w:color w:val="000000" w:themeColor="text1"/>
+                <w:kern w:val="0"/>
+                <w14:ligatures w14:val="none"/>
+              </w:rPr>
+              <w:t>Teenu</w:t>
+            </w:r>
+            <w:proofErr w:type="spellEnd"/>
+            <w:r>
+              <w:rPr>
+                <w:rFonts w:ascii="Times New Roman" w:eastAsia="Times New Roman" w:hAnsi="Times New Roman" w:cs="Times New Roman"/>
+                <w:color w:val="000000" w:themeColor="text1"/>
+                <w:kern w:val="0"/>
+                <w14:ligatures w14:val="none"/>
+              </w:rPr>
+              <w:t xml:space="preserve"> Deekshith</w:t>
+            </w:r>
+          </w:p>
+        </w:tc>
+      </w:tr>
+      <w:tr>
+        <w:trPr>
+          <w:tblCellSpacing w:w="15" w:type="dxa"/>
+        </w:trPr>
+        <w:tc>
+          <w:tcPr>
+            <w:tcW w:w="0" w:type="auto"/>
+            <w:vAlign w:val="center"/>
+            <w:hideMark/>
+          </w:tcPr>
+          <w:p>
+            <w:pPr>
+              <w:spacing w:after="0" w:line="240" w:lineRule="auto"/>
+              <w:rPr>
+                <w:rFonts w:ascii="Times New Roman" w:eastAsia="Times New Roman" w:hAnsi="Times New Roman" w:cs="Times New Roman"/>
+                <w:color w:val="000000" w:themeColor="text1"/>
+                <w:kern w:val="0"/>
+                <w14:ligatures w14:val="none"/>
+              </w:rPr>
+            </w:pPr>
+            <w:r>
+              <w:rPr>
+                <w:rFonts w:ascii="Times New Roman" w:eastAsia="Times New Roman" w:hAnsi="Times New Roman" w:cs="Times New Roman"/>
+                <w:color w:val="000000" w:themeColor="text1"/>
+                <w:kern w:val="0"/>
+                <w14:ligatures w14:val="none"/>
+              </w:rPr>
+              <w:t>Manufacturing Production Monitoring System</w:t>
+            </w:r>
+          </w:p>
+        </w:tc>
+        <w:tc>
+          <w:tcPr>
+            <w:tcW w:w="0" w:type="auto"/>
+            <w:vAlign w:val="center"/>
+            <w:hideMark/>
+          </w:tcPr>
+          <w:p>
+            <w:pPr>
+              <w:spacing w:after="0" w:line="240" w:lineRule="auto"/>
+              <w:rPr>
+                <w:rFonts w:ascii="Times New Roman" w:eastAsia="Times New Roman" w:hAnsi="Times New Roman" w:cs="Times New Roman"/>
+                <w:color w:val="000000" w:themeColor="text1"/>
+                <w:kern w:val="0"/>
+                <w14:ligatures w14:val="none"/>
+              </w:rPr>
+            </w:pPr>
+            <w:r>
+              <w:rPr>
+                <w:rFonts w:ascii="Times New Roman" w:eastAsia="Times New Roman" w:hAnsi="Times New Roman" w:cs="Times New Roman"/>
+                <w:color w:val="000000" w:themeColor="text1"/>
+                <w:kern w:val="0"/>
+                <w14:ligatures w14:val="none"/>
+              </w:rPr>
+              <w:t>Mohamed Abubakkar S, Vaibhav Gupta</w:t>
+            </w:r>
+          </w:p>
+        </w:tc>
+      </w:tr>
+      <w:tr>
+        <w:trPr>
+          <w:tblCellSpacing w:w="15" w:type="dxa"/>
+        </w:trPr>
+        <w:tc>
+          <w:tcPr>
+            <w:tcW w:w="0" w:type="auto"/>
+            <w:vAlign w:val="center"/>
+            <w:hideMark/>
+          </w:tcPr>
+          <w:p>
+            <w:pPr>
+              <w:spacing w:after="0" w:line="240" w:lineRule="auto"/>
+              <w:rPr>
+                <w:rFonts w:ascii="Times New Roman" w:eastAsia="Times New Roman" w:hAnsi="Times New Roman" w:cs="Times New Roman"/>
+                <w:color w:val="000000" w:themeColor="text1"/>
+                <w:kern w:val="0"/>
+                <w14:ligatures w14:val="none"/>
+              </w:rPr>
+            </w:pPr>
+            <w:r>
+              <w:rPr>
+                <w:rFonts w:ascii="Times New Roman" w:eastAsia="Times New Roman" w:hAnsi="Times New Roman" w:cs="Times New Roman"/>
+                <w:color w:val="000000" w:themeColor="text1"/>
+                <w:kern w:val="0"/>
+                <w14:ligatures w14:val="none"/>
+              </w:rPr>
+              <w:t>Learning Management System (LMS)</w:t>
+            </w:r>
+          </w:p>
+        </w:tc>
+        <w:tc>
+          <w:tcPr>
+            <w:tcW w:w="0" w:type="auto"/>
+            <w:vAlign w:val="center"/>
+            <w:hideMark/>
+          </w:tcPr>
+          <w:p>
+            <w:pPr>
+              <w:spacing w:after="0" w:line="240" w:lineRule="auto"/>
+              <w:rPr>
+                <w:rFonts w:ascii="Times New Roman" w:eastAsia="Times New Roman" w:hAnsi="Times New Roman" w:cs="Times New Roman"/>
+                <w:color w:val="000000" w:themeColor="text1"/>
+                <w:kern w:val="0"/>
+                <w14:ligatures w14:val="none"/>
+              </w:rPr>
+            </w:pPr>
+            <w:proofErr w:type="spellStart"/>
+            <w:r>
+              <w:rPr>
+                <w:rFonts w:ascii="Times New Roman" w:eastAsia="Times New Roman" w:hAnsi="Times New Roman" w:cs="Times New Roman"/>
+                <w:color w:val="000000" w:themeColor="text1"/>
+                <w:kern w:val="0"/>
+                <w14:ligatures w14:val="none"/>
+              </w:rPr>
+              <w:t>Nandhiraja</w:t>
+            </w:r>
+            <w:proofErr w:type="spellEnd"/>
+            <w:r>
+              <w:rPr>
+                <w:rFonts w:ascii="Times New Roman" w:eastAsia="Times New Roman" w:hAnsi="Times New Roman" w:cs="Times New Roman"/>
+                <w:color w:val="000000" w:themeColor="text1"/>
+                <w:kern w:val="0"/>
+                <w14:ligatures w14:val="none"/>
+              </w:rPr>
+              <w:t xml:space="preserve"> K, Vigneshwaran B</w:t>
+            </w:r>
+          </w:p>
+        </w:tc>
+      </w:tr>
+      <w:tr>
+        <w:trPr>
+          <w:tblCellSpacing w:w="15" w:type="dxa"/>
+        </w:trPr>
+        <w:tc>
+          <w:tcPr>
+            <w:tcW w:w="0" w:type="auto"/>
+            <w:vAlign w:val="center"/>
+            <w:hideMark/>
+          </w:tcPr>
+          <w:p>
+            <w:pPr>
+              <w:spacing w:after="0" w:line="240" w:lineRule="auto"/>
+              <w:rPr>
+                <w:rFonts w:ascii="Times New Roman" w:eastAsia="Times New Roman" w:hAnsi="Times New Roman" w:cs="Times New Roman"/>
+                <w:color w:val="000000" w:themeColor="text1"/>
+                <w:kern w:val="0"/>
+                <w14:ligatures w14:val="none"/>
+              </w:rPr>
+            </w:pPr>
+            <w:r>
+              <w:rPr>
+                <w:rFonts w:ascii="Times New Roman" w:eastAsia="Times New Roman" w:hAnsi="Times New Roman" w:cs="Times New Roman"/>
+                <w:color w:val="000000" w:themeColor="text1"/>
+                <w:kern w:val="0"/>
+                <w14:ligatures w14:val="none"/>
+              </w:rPr>
+              <w:lastRenderedPageBreak/>
+              <w:t>Hotel &amp; Resort Operations Management</w:t>
+            </w:r>
+          </w:p>
+        </w:tc>
+        <w:tc>
+          <w:tcPr>
+            <w:tcW w:w="0" w:type="auto"/>
+            <w:vAlign w:val="center"/>
+            <w:hideMark/>
+          </w:tcPr>
+          <w:p>
+            <w:pPr>
+              <w:spacing w:after="0" w:line="240" w:lineRule="auto"/>
+              <w:rPr>
+                <w:rFonts w:ascii="Times New Roman" w:eastAsia="Times New Roman" w:hAnsi="Times New Roman" w:cs="Times New Roman"/>
+                <w:color w:val="000000" w:themeColor="text1"/>
+                <w:kern w:val="0"/>
+                <w14:ligatures w14:val="none"/>
+              </w:rPr>
+            </w:pPr>
+            <w:r>
+              <w:rPr>
+                <w:rFonts w:ascii="Times New Roman" w:eastAsia="Times New Roman" w:hAnsi="Times New Roman" w:cs="Times New Roman"/>
+                <w:color w:val="000000" w:themeColor="text1"/>
+                <w:kern w:val="0"/>
+                <w14:ligatures w14:val="none"/>
+              </w:rPr>
+              <w:t>Nipun Sharma, Vijay D V</w:t>
+            </w:r>
+          </w:p>
+        </w:tc>
+      </w:tr>
+      <w:tr>
+        <w:trPr>
+          <w:tblCellSpacing w:w="15" w:type="dxa"/>
+        </w:trPr>
+        <w:tc>
+          <w:tcPr>
+            <w:tcW w:w="0" w:type="auto"/>
+            <w:vAlign w:val="center"/>
+            <w:hideMark/>
+          </w:tcPr>
+          <w:p>
+            <w:pPr>
+              <w:spacing w:after="0" w:line="240" w:lineRule="auto"/>
+              <w:rPr>
+                <w:rFonts w:ascii="Times New Roman" w:eastAsia="Times New Roman" w:hAnsi="Times New Roman" w:cs="Times New Roman"/>
+                <w:color w:val="000000" w:themeColor="text1"/>
+                <w:kern w:val="0"/>
+                <w14:ligatures w14:val="none"/>
+              </w:rPr>
+            </w:pPr>
+            <w:r>
+              <w:rPr>
+                <w:rFonts w:ascii="Times New Roman" w:eastAsia="Times New Roman" w:hAnsi="Times New Roman" w:cs="Times New Roman"/>
+                <w:color w:val="000000" w:themeColor="text1"/>
+                <w:kern w:val="0"/>
+                <w14:ligatures w14:val="none"/>
+              </w:rPr>
+              <w:t>Agriculture &amp; Farm Monitoring Platform</w:t>
+            </w:r>
+          </w:p>
+        </w:tc>
+        <w:tc>
+          <w:tcPr>
+            <w:tcW w:w="0" w:type="auto"/>
+            <w:vAlign w:val="center"/>
+            <w:hideMark/>
+          </w:tcPr>
+          <w:p>
+            <w:pPr>
+              <w:spacing w:after="0" w:line="240" w:lineRule="auto"/>
+              <w:rPr>
+                <w:rFonts w:ascii="Times New Roman" w:eastAsia="Times New Roman" w:hAnsi="Times New Roman" w:cs="Times New Roman"/>
+                <w:color w:val="000000" w:themeColor="text1"/>
+                <w:kern w:val="0"/>
+                <w14:ligatures w14:val="none"/>
+              </w:rPr>
+            </w:pPr>
+            <w:r>
+              <w:rPr>
+                <w:rFonts w:ascii="Times New Roman" w:eastAsia="Times New Roman" w:hAnsi="Times New Roman" w:cs="Times New Roman"/>
+                <w:color w:val="000000" w:themeColor="text1"/>
+                <w:kern w:val="0"/>
+                <w14:ligatures w14:val="none"/>
+              </w:rPr>
+              <w:t>Padmavathi SJ</w:t>
+            </w:r>
+          </w:p>
+        </w:tc>
+      </w:tr>
+      <w:tr>
+        <w:trPr>
+          <w:tblCellSpacing w:w="15" w:type="dxa"/>
+        </w:trPr>
+        <w:tc>
+          <w:tcPr>
+            <w:tcW w:w="0" w:type="auto"/>
+            <w:vAlign w:val="center"/>
+            <w:hideMark/>
+          </w:tcPr>
+          <w:p>
+            <w:pPr>
+              <w:spacing w:after="0" w:line="240" w:lineRule="auto"/>
+              <w:rPr>
+                <w:rFonts w:ascii="Times New Roman" w:eastAsia="Times New Roman" w:hAnsi="Times New Roman" w:cs="Times New Roman"/>
+                <w:color w:val="000000" w:themeColor="text1"/>
+                <w:kern w:val="0"/>
+                <w14:ligatures w14:val="none"/>
+              </w:rPr>
+            </w:pPr>
+            <w:r>
+              <w:rPr>
+                <w:rFonts w:ascii="Times New Roman" w:eastAsia="Times New Roman" w:hAnsi="Times New Roman" w:cs="Times New Roman"/>
+                <w:color w:val="000000" w:themeColor="text1"/>
+                <w:kern w:val="0"/>
+                <w14:ligatures w14:val="none"/>
+              </w:rPr>
+              <w:t>Digital Document Approval Workflow System</w:t>
+            </w:r>
+          </w:p>
+        </w:tc>
+        <w:tc>
+          <w:tcPr>
+            <w:tcW w:w="0" w:type="auto"/>
+            <w:vAlign w:val="center"/>
+            <w:hideMark/>
+          </w:tcPr>
+          <w:p>
+            <w:pPr>
+              <w:spacing w:after="0" w:line="240" w:lineRule="auto"/>
+              <w:rPr>
+                <w:rFonts w:ascii="Times New Roman" w:eastAsia="Times New Roman" w:hAnsi="Times New Roman" w:cs="Times New Roman"/>
+                <w:color w:val="000000" w:themeColor="text1"/>
+                <w:kern w:val="0"/>
+                <w14:ligatures w14:val="none"/>
+              </w:rPr>
+            </w:pPr>
+            <w:r>
+              <w:rPr>
+                <w:rFonts w:ascii="Times New Roman" w:eastAsia="Times New Roman" w:hAnsi="Times New Roman" w:cs="Times New Roman"/>
+                <w:color w:val="000000" w:themeColor="text1"/>
+                <w:kern w:val="0"/>
+                <w14:ligatures w14:val="none"/>
+              </w:rPr>
+              <w:t>Pratik Sarangi</w:t>
+            </w:r>
+          </w:p>
+        </w:tc>
+      </w:tr>
+      <w:tr>
+        <w:trPr>
+          <w:tblCellSpacing w:w="15" w:type="dxa"/>
+        </w:trPr>
+        <w:tc>
+          <w:tcPr>
+            <w:tcW w:w="0" w:type="auto"/>
+            <w:vAlign w:val="center"/>
+            <w:hideMark/>
+          </w:tcPr>
+          <w:p>
+            <w:pPr>
+              <w:spacing w:after="0" w:line="240" w:lineRule="auto"/>
+              <w:rPr>
+                <w:rFonts w:ascii="Times New Roman" w:eastAsia="Times New Roman" w:hAnsi="Times New Roman" w:cs="Times New Roman"/>
+                <w:color w:val="000000" w:themeColor="text1"/>
+                <w:kern w:val="0"/>
+                <w14:ligatures w14:val="none"/>
+              </w:rPr>
+            </w:pPr>
+            <w:r>
+              <w:rPr>
+                <w:rFonts w:ascii="Times New Roman" w:eastAsia="Times New Roman" w:hAnsi="Times New Roman" w:cs="Times New Roman"/>
+                <w:color w:val="000000" w:themeColor="text1"/>
+                <w:kern w:val="0"/>
+                <w14:ligatures w14:val="none"/>
+              </w:rPr>
+              <w:t>Smart Society / Apartment Management System</w:t>
+            </w:r>
+          </w:p>
+        </w:tc>
+        <w:tc>
+          <w:tcPr>
+            <w:tcW w:w="0" w:type="auto"/>
+            <w:vAlign w:val="center"/>
+            <w:hideMark/>
+          </w:tcPr>
+          <w:p>
+            <w:pPr>
+              <w:spacing w:after="0" w:line="240" w:lineRule="auto"/>
+              <w:rPr>
+                <w:rFonts w:ascii="Times New Roman" w:eastAsia="Times New Roman" w:hAnsi="Times New Roman" w:cs="Times New Roman"/>
+                <w:color w:val="000000" w:themeColor="text1"/>
+                <w:kern w:val="0"/>
+                <w14:ligatures w14:val="none"/>
+              </w:rPr>
+            </w:pPr>
+            <w:r>
+              <w:rPr>
+                <w:rFonts w:ascii="Times New Roman" w:eastAsia="Times New Roman" w:hAnsi="Times New Roman" w:cs="Times New Roman"/>
+                <w:color w:val="000000" w:themeColor="text1"/>
+                <w:kern w:val="0"/>
+                <w14:ligatures w14:val="none"/>
+              </w:rPr>
+              <w:t xml:space="preserve">Preetam </w:t>
+            </w:r>
+            <w:proofErr w:type="spellStart"/>
+            <w:r>
+              <w:rPr>
+                <w:rFonts w:ascii="Times New Roman" w:eastAsia="Times New Roman" w:hAnsi="Times New Roman" w:cs="Times New Roman"/>
+                <w:color w:val="000000" w:themeColor="text1"/>
+                <w:kern w:val="0"/>
+                <w14:ligatures w14:val="none"/>
+              </w:rPr>
+              <w:t>Sasisekhara</w:t>
+            </w:r>
+            <w:proofErr w:type="spellEnd"/>
+            <w:r>
+              <w:rPr>
+                <w:rFonts w:ascii="Times New Roman" w:eastAsia="Times New Roman" w:hAnsi="Times New Roman" w:cs="Times New Roman"/>
+                <w:color w:val="000000" w:themeColor="text1"/>
+                <w:kern w:val="0"/>
+                <w14:ligatures w14:val="none"/>
+              </w:rPr>
+              <w:t xml:space="preserve"> </w:t>
+            </w:r>
+            <w:proofErr w:type="spellStart"/>
+            <w:r>
+              <w:rPr>
+                <w:rFonts w:ascii="Times New Roman" w:eastAsia="Times New Roman" w:hAnsi="Times New Roman" w:cs="Times New Roman"/>
+                <w:color w:val="000000" w:themeColor="text1"/>
+                <w:kern w:val="0"/>
+                <w14:ligatures w14:val="none"/>
+              </w:rPr>
+              <w:t>Kommavarapu</w:t>
+            </w:r>
+            <w:proofErr w:type="spellEnd"/>
+          </w:p>
+        </w:tc>
+      </w:tr>
+    </w:tbl>
+    <w:p/>
     <w:p/>
     <w:p/>
     <w:sectPr>

</xml_diff>